<commit_message>
Completa limpieza académica de documentos y tablas
</commit_message>
<xml_diff>
--- a/outputs/documentos_tfg/resultados_desarrollados_tfg.docx
+++ b/outputs/documentos_tfg/resultados_desarrollados_tfg.docx
@@ -35,7 +35,7 @@
           <w:rFonts w:ascii="Times New Roman" w:hAnsi="Times New Roman"/>
           <w:sz w:val="24"/>
         </w:rPr>
-        <w:t>La caracterización de las muestras analizadas permitió establecer los parámetros fisicoquímicos usados como entradas del inventario de ciclo de vida. El estiércol fresco presentó una humedad promedio de 85,77 % y una materia seca de 14,23 %. El estiércol precompostado presentó una humedad promedio de 77,59 % y una materia seca de 22,41 %.</w:t>
+        <w:t>La caracterización de las muestras analizadas permitió establecer los parámetros fisicoquímicos usados como entradas del inventario de ciclo de vida. El estiércol fresco presentó una húmedad promedio de 85,77 % y una materia seca de 14,23 %. El estiércol precompostado presentó una húmedad promedio de 77,59 % y una materia seca de 22,41 %.</w:t>
       </w:r>
     </w:p>
     <w:p>
@@ -59,7 +59,7 @@
           <w:rFonts w:ascii="Times New Roman" w:hAnsi="Times New Roman"/>
           <w:sz w:val="24"/>
         </w:rPr>
-        <w:t>La Tabla 1 resume los valores de caracterización de las muestras. La Figura 1 presenta humedad y materia seca, mientras que la Figura 2 presenta sólidos volátiles y cenizas.</w:t>
+        <w:t>La Tabla 1 resume los valores de caracterización de las muestras. La Figura 1 presenta húmedad y materia seca, mientras que la Figura 2 presenta sólidos volátiles y cenizas.</w:t>
       </w:r>
     </w:p>
     <w:p>
@@ -1026,7 +1026,7 @@
               <w:rPr>
                 <w:b/>
               </w:rPr>
-              <w:t>N total reportado (%) (%)</w:t>
+              <w:t>N total reportado (%)</w:t>
             </w:r>
           </w:p>
         </w:tc>
@@ -3269,7 +3269,7 @@
           </w:tcPr>
           <w:p>
             <w:r>
-              <w:t>% masa humeda</w:t>
+              <w:t>% masa húmeda</w:t>
             </w:r>
           </w:p>
         </w:tc>
@@ -3370,7 +3370,7 @@
           </w:tcPr>
           <w:p>
             <w:r>
-              <w:t>% masa humeda</w:t>
+              <w:t>% masa húmeda</w:t>
             </w:r>
           </w:p>
         </w:tc>
@@ -3550,7 +3550,7 @@
           </w:tcPr>
           <w:p>
             <w:r>
-              <w:t>Sólidos volatiles</w:t>
+              <w:t>Sólidos volátiles</w:t>
             </w:r>
           </w:p>
         </w:tc>
@@ -3871,7 +3871,7 @@
           </w:tcPr>
           <w:p>
             <w:r>
-              <w:t>% masa humeda</w:t>
+              <w:t>% masa húmeda</w:t>
             </w:r>
           </w:p>
         </w:tc>
@@ -3972,7 +3972,7 @@
           </w:tcPr>
           <w:p>
             <w:r>
-              <w:t>% masa humeda</w:t>
+              <w:t>% masa húmeda</w:t>
             </w:r>
           </w:p>
         </w:tc>
@@ -4152,7 +4152,7 @@
           </w:tcPr>
           <w:p>
             <w:r>
-              <w:t>Sólidos volatiles</w:t>
+              <w:t>Sólidos volátiles</w:t>
             </w:r>
           </w:p>
         </w:tc>
@@ -5222,7 +5222,7 @@
           </w:tcPr>
           <w:p>
             <w:r>
-              <w:t>Fracción de boñiga asociada a aguas verdes</w:t>
+              <w:t>Fracción de boñiga incorporada a las aguas verdes</w:t>
             </w:r>
           </w:p>
         </w:tc>
@@ -5450,7 +5450,7 @@
           </w:tcPr>
           <w:p>
             <w:r>
-              <w:t>Estiercol sólido o purín</w:t>
+              <w:t>Purín almacenado</w:t>
             </w:r>
           </w:p>
         </w:tc>
@@ -5507,7 +5507,7 @@
           </w:tcPr>
           <w:p>
             <w:r>
-              <w:t>Aguas verdes</w:t>
+              <w:t>Agua de lavado incorporada al purín</w:t>
             </w:r>
           </w:p>
         </w:tc>
@@ -5994,7 +5994,7 @@
               <w:rPr>
                 <w:b/>
               </w:rPr>
-              <w:t>Sístema de manejo asignado</w:t>
+              <w:t>Sistema de manejo asignado</w:t>
             </w:r>
           </w:p>
         </w:tc>
@@ -6093,7 +6093,7 @@
           </w:tcPr>
           <w:p>
             <w:r>
-              <w:t>Sístema de manejo en corral seco</w:t>
+              <w:t>Sistema de manejo en corral seco</w:t>
             </w:r>
           </w:p>
         </w:tc>
@@ -6183,7 +6183,7 @@
           </w:tcPr>
           <w:p>
             <w:r>
-              <w:t>Sístema de manejo en corral seco</w:t>
+              <w:t>Sistema de manejo en corral seco</w:t>
             </w:r>
           </w:p>
         </w:tc>
@@ -6273,7 +6273,7 @@
           </w:tcPr>
           <w:p>
             <w:r>
-              <w:t>Sístema de manejo en corral seco</w:t>
+              <w:t>Sistema de manejo en corral seco</w:t>
             </w:r>
           </w:p>
         </w:tc>
@@ -6284,7 +6284,7 @@
           </w:tcPr>
           <w:p>
             <w:r>
-              <w:t>Sólidos volatiles</w:t>
+              <w:t>Sólidos volátiles</w:t>
             </w:r>
           </w:p>
         </w:tc>
@@ -6363,7 +6363,7 @@
           </w:tcPr>
           <w:p>
             <w:r>
-              <w:t>Sístema de manejo en corral seco</w:t>
+              <w:t>Sistema de manejo en corral seco</w:t>
             </w:r>
           </w:p>
         </w:tc>
@@ -6453,7 +6453,7 @@
           </w:tcPr>
           <w:p>
             <w:r>
-              <w:t>Sístema de manejo en corral seco</w:t>
+              <w:t>Sistema de manejo en corral seco</w:t>
             </w:r>
           </w:p>
         </w:tc>
@@ -6543,7 +6543,7 @@
           </w:tcPr>
           <w:p>
             <w:r>
-              <w:t>Sístema de manejo en corral seco</w:t>
+              <w:t>Sistema de manejo en corral seco</w:t>
             </w:r>
           </w:p>
         </w:tc>
@@ -6633,7 +6633,7 @@
           </w:tcPr>
           <w:p>
             <w:r>
-              <w:t>Sístema de manejo en corral seco</w:t>
+              <w:t>Sistema de manejo en corral seco</w:t>
             </w:r>
           </w:p>
         </w:tc>
@@ -6723,7 +6723,7 @@
           </w:tcPr>
           <w:p>
             <w:r>
-              <w:t>Sístema de manejo en corral seco</w:t>
+              <w:t>Sistema de manejo en corral seco</w:t>
             </w:r>
           </w:p>
         </w:tc>
@@ -7004,7 +7004,7 @@
           </w:tcPr>
           <w:p>
             <w:r>
-              <w:t>Sólidos volatiles</w:t>
+              <w:t>Sólidos volátiles</w:t>
             </w:r>
           </w:p>
         </w:tc>
@@ -7724,7 +7724,7 @@
           </w:tcPr>
           <w:p>
             <w:r>
-              <w:t>Sólidos volatiles</w:t>
+              <w:t>Sólidos volátiles</w:t>
             </w:r>
           </w:p>
         </w:tc>
@@ -8444,7 +8444,7 @@
           </w:tcPr>
           <w:p>
             <w:r>
-              <w:t>Sólidos volatiles</w:t>
+              <w:t>Sólidos volátiles</w:t>
             </w:r>
           </w:p>
         </w:tc>
@@ -9162,7 +9162,7 @@
           </w:tcPr>
           <w:p>
             <w:r>
-              <w:t>Sólidos volatiles</w:t>
+              <w:t>Sólidos volátiles</w:t>
             </w:r>
           </w:p>
         </w:tc>
@@ -9882,7 +9882,7 @@
           </w:tcPr>
           <w:p>
             <w:r>
-              <w:t>Sólidos volatiles</w:t>
+              <w:t>Sólidos volátiles</w:t>
             </w:r>
           </w:p>
         </w:tc>
@@ -10416,7 +10416,7 @@
               <w:rPr>
                 <w:b/>
               </w:rPr>
-              <w:t>tipo_factor</w:t>
+              <w:t>Tipo de factor</w:t>
             </w:r>
           </w:p>
         </w:tc>
@@ -10430,7 +10430,7 @@
               <w:rPr>
                 <w:b/>
               </w:rPr>
-              <w:t>sistema_o_compuesto</w:t>
+              <w:t>Sistema o compuesto evaluado</w:t>
             </w:r>
           </w:p>
         </w:tc>
@@ -10496,7 +10496,7 @@
           </w:tcPr>
           <w:p>
             <w:r>
-              <w:t>Sístema de manejo en corral seco</w:t>
+              <w:t>Sistema de manejo en corral seco</w:t>
             </w:r>
           </w:p>
         </w:tc>
@@ -10553,7 +10553,7 @@
           </w:tcPr>
           <w:p>
             <w:r>
-              <w:t>Sístema de manejo en corral seco</w:t>
+              <w:t>Sistema de manejo en corral seco</w:t>
             </w:r>
           </w:p>
         </w:tc>
@@ -10610,7 +10610,7 @@
           </w:tcPr>
           <w:p>
             <w:r>
-              <w:t>Sístema de manejo en corral seco</w:t>
+              <w:t>Sistema de manejo en corral seco</w:t>
             </w:r>
           </w:p>
         </w:tc>
@@ -10667,7 +10667,7 @@
           </w:tcPr>
           <w:p>
             <w:r>
-              <w:t>Sístema de manejo en corral seco</w:t>
+              <w:t>Sistema de manejo en corral seco</w:t>
             </w:r>
           </w:p>
         </w:tc>
@@ -11636,7 +11636,7 @@
           </w:tcPr>
           <w:p>
             <w:r>
-              <w:t>Sístema líquido tipo purín</w:t>
+              <w:t>Sistema líquido tipo purín</w:t>
             </w:r>
           </w:p>
         </w:tc>
@@ -11693,7 +11693,7 @@
           </w:tcPr>
           <w:p>
             <w:r>
-              <w:t>Sístema líquido tipo purín</w:t>
+              <w:t>Sistema líquido tipo purín</w:t>
             </w:r>
           </w:p>
         </w:tc>
@@ -11750,7 +11750,7 @@
           </w:tcPr>
           <w:p>
             <w:r>
-              <w:t>Sístema líquido tipo purín</w:t>
+              <w:t>Sistema líquido tipo purín</w:t>
             </w:r>
           </w:p>
         </w:tc>
@@ -11807,7 +11807,7 @@
           </w:tcPr>
           <w:p>
             <w:r>
-              <w:t>Sístema líquido tipo purín</w:t>
+              <w:t>Sistema líquido tipo purín</w:t>
             </w:r>
           </w:p>
         </w:tc>
@@ -12785,7 +12785,7 @@
           </w:tcPr>
           <w:p>
             <w:r>
-              <w:t>B0_T</w:t>
+              <w:t>B0 T</w:t>
             </w:r>
           </w:p>
         </w:tc>
@@ -12950,7 +12950,7 @@
           </w:tcPr>
           <w:p>
             <w:r>
-              <w:t>N_cdg</w:t>
+              <w:t>N cdg</w:t>
             </w:r>
           </w:p>
         </w:tc>
@@ -13170,7 +13170,7 @@
           </w:tcPr>
           <w:p>
             <w:r>
-              <w:t>frac_gasm</w:t>
+              <w:t>frac gasm</w:t>
             </w:r>
           </w:p>
         </w:tc>
@@ -13225,7 +13225,7 @@
           </w:tcPr>
           <w:p>
             <w:r>
-              <w:t>frac_leach_h</w:t>
+              <w:t>frac leach h</w:t>
             </w:r>
           </w:p>
         </w:tc>
@@ -13280,7 +13280,7 @@
           </w:tcPr>
           <w:p>
             <w:r>
-              <w:t>R_N2_N₂O</w:t>
+              <w:t>R N2 N₂O</w:t>
             </w:r>
           </w:p>
         </w:tc>
@@ -13335,7 +13335,7 @@
           </w:tcPr>
           <w:p>
             <w:r>
-              <w:t>FACTOR_N_A_N₂O</w:t>
+              <w:t>FACTOR N A N₂O</w:t>
             </w:r>
           </w:p>
         </w:tc>
@@ -13390,7 +13390,7 @@
           </w:tcPr>
           <w:p>
             <w:r>
-              <w:t>FACTOR_N_A_NH₃</w:t>
+              <w:t>FACTOR N A NH₃</w:t>
             </w:r>
           </w:p>
         </w:tc>
@@ -13445,7 +13445,7 @@
           </w:tcPr>
           <w:p>
             <w:r>
-              <w:t>FACTOR_N_A_NO₃⁻</w:t>
+              <w:t>FACTOR N A NO₃⁻</w:t>
             </w:r>
           </w:p>
         </w:tc>
@@ -13500,7 +13500,7 @@
           </w:tcPr>
           <w:p>
             <w:r>
-              <w:t>CH_4_eq</w:t>
+              <w:t>CH 4 eq</w:t>
             </w:r>
           </w:p>
         </w:tc>
@@ -13555,7 +13555,7 @@
           </w:tcPr>
           <w:p>
             <w:r>
-              <w:t>N_2_O_eq</w:t>
+              <w:t>N 2 O eq</w:t>
             </w:r>
           </w:p>
         </w:tc>
@@ -13610,7 +13610,7 @@
           </w:tcPr>
           <w:p>
             <w:r>
-              <w:t>NH_3_eq</w:t>
+              <w:t>NH 3 eq</w:t>
             </w:r>
           </w:p>
         </w:tc>
@@ -13665,7 +13665,7 @@
           </w:tcPr>
           <w:p>
             <w:r>
-              <w:t>NO_3_eq</w:t>
+              <w:t>NO 3 eq</w:t>
             </w:r>
           </w:p>
         </w:tc>
@@ -13720,7 +13720,7 @@
           </w:tcPr>
           <w:p>
             <w:r>
-              <w:t>co2_kg_por_kg_residuo_seco</w:t>
+              <w:t>co2 kg por kg residuo seco</w:t>
             </w:r>
           </w:p>
         </w:tc>
@@ -13775,7 +13775,7 @@
           </w:tcPr>
           <w:p>
             <w:r>
-              <w:t>ch4_kg_por_kg_residuo_seco</w:t>
+              <w:t>ch4 kg por kg residuo seco</w:t>
             </w:r>
           </w:p>
         </w:tc>
@@ -13830,7 +13830,7 @@
           </w:tcPr>
           <w:p>
             <w:r>
-              <w:t>n2o_kg_por_kg_residuo_seco</w:t>
+              <w:t>n2o kg por kg residuo seco</w:t>
             </w:r>
           </w:p>
         </w:tc>
@@ -20413,7 +20413,7 @@
               <w:rPr>
                 <w:b/>
               </w:rPr>
-              <w:t>resultado_total</w:t>
+              <w:t>Resultado total</w:t>
             </w:r>
           </w:p>
         </w:tc>
@@ -20691,7 +20691,7 @@
               <w:rPr>
                 <w:b/>
               </w:rPr>
-              <w:t>escenario_A</w:t>
+              <w:t>Escenario A</w:t>
             </w:r>
           </w:p>
         </w:tc>
@@ -20705,7 +20705,7 @@
               <w:rPr>
                 <w:b/>
               </w:rPr>
-              <w:t>escenario_B</w:t>
+              <w:t>Escenario B</w:t>
             </w:r>
           </w:p>
         </w:tc>
@@ -20733,7 +20733,7 @@
               <w:rPr>
                 <w:b/>
               </w:rPr>
-              <w:t>diferencia_absoluta_B_menos_A</w:t>
+              <w:t>Diferencia absoluta B − A</w:t>
             </w:r>
           </w:p>
         </w:tc>
@@ -20747,7 +20747,7 @@
               <w:rPr>
                 <w:b/>
               </w:rPr>
-              <w:t>diferencia_porcentual_B_vs_A</w:t>
+              <w:t>Diferencia porcentual B respecto a A</w:t>
             </w:r>
           </w:p>
         </w:tc>
@@ -20761,7 +20761,7 @@
               <w:rPr>
                 <w:b/>
               </w:rPr>
-              <w:t>escenario_con_mayor_impacto</w:t>
+              <w:t>Escenario con mayor impacto</w:t>
             </w:r>
           </w:p>
         </w:tc>

</xml_diff>